<commit_message>
Churn notebook: causal AIPW, auto-adapt, leak safety net, robust target/ID/group detection, range parsing; example final report from real Kaggle data; verified background & literature kit
</commit_message>
<xml_diff>
--- a/01_Churn_Insurance/Article_Template_Final_Stage.docx
+++ b/01_Churn_Insurance/Article_Template_Final_Stage.docx
@@ -781,7 +781,7 @@
       <w:outlineLvl w:val="0"/>
     </w:pPr>
     <w:rPr>
-      <w:rFonts w:asciiTheme="majorHAnsi" w:eastAsiaTheme="majorEastAsia" w:hAnsiTheme="majorHAnsi" w:cstheme="majorBidi" w:ascii="Times New Roman" w:hAnsi="Times New Roman" w:eastAsia="Times New Roman" w:cs="Times New Roman"/>
+      <w:rFonts w:ascii="Times New Roman" w:hAnsi="Times New Roman" w:eastAsia="Times New Roman" w:cs="Times New Roman"/>
       <w:b/>
       <w:bCs/>
       <w:color w:val="000000"/>
@@ -805,7 +805,7 @@
       <w:outlineLvl w:val="1"/>
     </w:pPr>
     <w:rPr>
-      <w:rFonts w:asciiTheme="majorHAnsi" w:eastAsiaTheme="majorEastAsia" w:hAnsiTheme="majorHAnsi" w:cstheme="majorBidi" w:ascii="Times New Roman" w:hAnsi="Times New Roman" w:eastAsia="Times New Roman" w:cs="Times New Roman"/>
+      <w:rFonts w:ascii="Times New Roman" w:hAnsi="Times New Roman" w:eastAsia="Times New Roman" w:cs="Times New Roman"/>
       <w:b/>
       <w:bCs/>
       <w:color w:val="000000"/>
@@ -829,7 +829,7 @@
       <w:outlineLvl w:val="2"/>
     </w:pPr>
     <w:rPr>
-      <w:rFonts w:asciiTheme="majorHAnsi" w:eastAsiaTheme="majorEastAsia" w:hAnsiTheme="majorHAnsi" w:cstheme="majorBidi"/>
+      <w:rFonts/>
       <w:b/>
       <w:bCs/>
       <w:color w:val="4F81BD" w:themeColor="accent1"/>
@@ -852,7 +852,7 @@
       <w:outlineLvl w:val="3"/>
     </w:pPr>
     <w:rPr>
-      <w:rFonts w:asciiTheme="majorHAnsi" w:eastAsiaTheme="majorEastAsia" w:hAnsiTheme="majorHAnsi" w:cstheme="majorBidi"/>
+      <w:rFonts/>
       <w:b/>
       <w:bCs/>
       <w:i/>
@@ -877,7 +877,7 @@
       <w:outlineLvl w:val="4"/>
     </w:pPr>
     <w:rPr>
-      <w:rFonts w:asciiTheme="majorHAnsi" w:eastAsiaTheme="majorEastAsia" w:hAnsiTheme="majorHAnsi" w:cstheme="majorBidi"/>
+      <w:rFonts/>
       <w:color w:val="243F60" w:themeColor="accent1" w:themeShade="7F"/>
     </w:rPr>
   </w:style>
@@ -898,7 +898,7 @@
       <w:outlineLvl w:val="5"/>
     </w:pPr>
     <w:rPr>
-      <w:rFonts w:asciiTheme="majorHAnsi" w:eastAsiaTheme="majorEastAsia" w:hAnsiTheme="majorHAnsi" w:cstheme="majorBidi"/>
+      <w:rFonts/>
       <w:i/>
       <w:iCs/>
       <w:color w:val="243F60" w:themeColor="accent1" w:themeShade="7F"/>
@@ -921,7 +921,7 @@
       <w:outlineLvl w:val="6"/>
     </w:pPr>
     <w:rPr>
-      <w:rFonts w:asciiTheme="majorHAnsi" w:eastAsiaTheme="majorEastAsia" w:hAnsiTheme="majorHAnsi" w:cstheme="majorBidi"/>
+      <w:rFonts/>
       <w:i/>
       <w:iCs/>
       <w:color w:val="404040" w:themeColor="text1" w:themeTint="BF"/>
@@ -944,7 +944,7 @@
       <w:outlineLvl w:val="7"/>
     </w:pPr>
     <w:rPr>
-      <w:rFonts w:asciiTheme="majorHAnsi" w:eastAsiaTheme="majorEastAsia" w:hAnsiTheme="majorHAnsi" w:cstheme="majorBidi"/>
+      <w:rFonts/>
       <w:color w:val="4F81BD" w:themeColor="accent1"/>
       <w:sz w:val="20"/>
       <w:szCs w:val="20"/>
@@ -967,7 +967,7 @@
       <w:outlineLvl w:val="8"/>
     </w:pPr>
     <w:rPr>
-      <w:rFonts w:asciiTheme="majorHAnsi" w:eastAsiaTheme="majorEastAsia" w:hAnsiTheme="majorHAnsi" w:cstheme="majorBidi"/>
+      <w:rFonts/>
       <w:i/>
       <w:iCs/>
       <w:color w:val="404040" w:themeColor="text1" w:themeTint="BF"/>
@@ -1018,7 +1018,7 @@
     <w:uiPriority w:val="9"/>
     <w:rsid w:val="00FC693F"/>
     <w:rPr>
-      <w:rFonts w:asciiTheme="majorHAnsi" w:eastAsiaTheme="majorEastAsia" w:hAnsiTheme="majorHAnsi" w:cstheme="majorBidi"/>
+      <w:rFonts/>
       <w:b/>
       <w:bCs/>
       <w:color w:val="365F91" w:themeColor="accent1" w:themeShade="BF"/>
@@ -1033,7 +1033,7 @@
     <w:uiPriority w:val="9"/>
     <w:rsid w:val="00FC693F"/>
     <w:rPr>
-      <w:rFonts w:asciiTheme="majorHAnsi" w:eastAsiaTheme="majorEastAsia" w:hAnsiTheme="majorHAnsi" w:cstheme="majorBidi"/>
+      <w:rFonts/>
       <w:b/>
       <w:bCs/>
       <w:color w:val="4F81BD" w:themeColor="accent1"/>
@@ -1048,7 +1048,7 @@
     <w:uiPriority w:val="9"/>
     <w:rsid w:val="00FC693F"/>
     <w:rPr>
-      <w:rFonts w:asciiTheme="majorHAnsi" w:eastAsiaTheme="majorEastAsia" w:hAnsiTheme="majorHAnsi" w:cstheme="majorBidi"/>
+      <w:rFonts/>
       <w:b/>
       <w:bCs/>
       <w:color w:val="4F81BD" w:themeColor="accent1"/>
@@ -1070,7 +1070,7 @@
       <w:contextualSpacing/>
     </w:pPr>
     <w:rPr>
-      <w:rFonts w:asciiTheme="majorHAnsi" w:eastAsiaTheme="majorEastAsia" w:hAnsiTheme="majorHAnsi" w:cstheme="majorBidi" w:ascii="Times New Roman" w:hAnsi="Times New Roman" w:eastAsia="Times New Roman" w:cs="Times New Roman"/>
+      <w:rFonts w:ascii="Times New Roman" w:hAnsi="Times New Roman" w:eastAsia="Times New Roman" w:cs="Times New Roman"/>
       <w:b/>
       <w:color w:val="000000"/>
       <w:spacing w:val="5"/>
@@ -1086,7 +1086,7 @@
     <w:uiPriority w:val="10"/>
     <w:rsid w:val="00FC693F"/>
     <w:rPr>
-      <w:rFonts w:asciiTheme="majorHAnsi" w:eastAsiaTheme="majorEastAsia" w:hAnsiTheme="majorHAnsi" w:cstheme="majorBidi"/>
+      <w:rFonts/>
       <w:color w:val="17365D" w:themeColor="text2" w:themeShade="BF"/>
       <w:spacing w:val="5"/>
       <w:kern w:val="28"/>
@@ -1108,7 +1108,7 @@
       </w:numPr>
     </w:pPr>
     <w:rPr>
-      <w:rFonts w:asciiTheme="majorHAnsi" w:eastAsiaTheme="majorEastAsia" w:hAnsiTheme="majorHAnsi" w:cstheme="majorBidi"/>
+      <w:rFonts/>
       <w:i/>
       <w:iCs/>
       <w:color w:val="4F81BD" w:themeColor="accent1"/>
@@ -1124,7 +1124,7 @@
     <w:uiPriority w:val="11"/>
     <w:rsid w:val="00FC693F"/>
     <w:rPr>
-      <w:rFonts w:asciiTheme="majorHAnsi" w:eastAsiaTheme="majorEastAsia" w:hAnsiTheme="majorHAnsi" w:cstheme="majorBidi"/>
+      <w:rFonts/>
       <w:i/>
       <w:iCs/>
       <w:color w:val="4F81BD" w:themeColor="accent1"/>
@@ -1422,7 +1422,7 @@
     <w:semiHidden/>
     <w:rsid w:val="00FC693F"/>
     <w:rPr>
-      <w:rFonts w:asciiTheme="majorHAnsi" w:eastAsiaTheme="majorEastAsia" w:hAnsiTheme="majorHAnsi" w:cstheme="majorBidi"/>
+      <w:rFonts/>
       <w:b/>
       <w:bCs/>
       <w:i/>
@@ -1438,7 +1438,7 @@
     <w:semiHidden/>
     <w:rsid w:val="00FC693F"/>
     <w:rPr>
-      <w:rFonts w:asciiTheme="majorHAnsi" w:eastAsiaTheme="majorEastAsia" w:hAnsiTheme="majorHAnsi" w:cstheme="majorBidi"/>
+      <w:rFonts/>
       <w:color w:val="243F60" w:themeColor="accent1" w:themeShade="7F"/>
     </w:rPr>
   </w:style>
@@ -1450,7 +1450,7 @@
     <w:semiHidden/>
     <w:rsid w:val="00FC693F"/>
     <w:rPr>
-      <w:rFonts w:asciiTheme="majorHAnsi" w:eastAsiaTheme="majorEastAsia" w:hAnsiTheme="majorHAnsi" w:cstheme="majorBidi"/>
+      <w:rFonts/>
       <w:i/>
       <w:iCs/>
       <w:color w:val="243F60" w:themeColor="accent1" w:themeShade="7F"/>
@@ -1464,7 +1464,7 @@
     <w:semiHidden/>
     <w:rsid w:val="00FC693F"/>
     <w:rPr>
-      <w:rFonts w:asciiTheme="majorHAnsi" w:eastAsiaTheme="majorEastAsia" w:hAnsiTheme="majorHAnsi" w:cstheme="majorBidi"/>
+      <w:rFonts/>
       <w:i/>
       <w:iCs/>
       <w:color w:val="404040" w:themeColor="text1" w:themeTint="BF"/>
@@ -1478,7 +1478,7 @@
     <w:semiHidden/>
     <w:rsid w:val="00FC693F"/>
     <w:rPr>
-      <w:rFonts w:asciiTheme="majorHAnsi" w:eastAsiaTheme="majorEastAsia" w:hAnsiTheme="majorHAnsi" w:cstheme="majorBidi"/>
+      <w:rFonts/>
       <w:color w:val="4F81BD" w:themeColor="accent1"/>
       <w:sz w:val="20"/>
       <w:szCs w:val="20"/>
@@ -1492,7 +1492,7 @@
     <w:semiHidden/>
     <w:rsid w:val="00FC693F"/>
     <w:rPr>
-      <w:rFonts w:asciiTheme="majorHAnsi" w:eastAsiaTheme="majorEastAsia" w:hAnsiTheme="majorHAnsi" w:cstheme="majorBidi"/>
+      <w:rFonts/>
       <w:i/>
       <w:iCs/>
       <w:color w:val="404040" w:themeColor="text1" w:themeTint="BF"/>
@@ -6343,7 +6343,7 @@
       <w:spacing w:after="0" w:line="240" w:lineRule="auto"/>
     </w:pPr>
     <w:rPr>
-      <w:rFonts w:asciiTheme="majorHAnsi" w:eastAsiaTheme="majorEastAsia" w:hAnsiTheme="majorHAnsi" w:cstheme="majorBidi"/>
+      <w:rFonts/>
       <w:color w:val="000000" w:themeColor="text1"/>
     </w:rPr>
     <w:tblPr>
@@ -6471,7 +6471,7 @@
       <w:spacing w:after="0" w:line="240" w:lineRule="auto"/>
     </w:pPr>
     <w:rPr>
-      <w:rFonts w:asciiTheme="majorHAnsi" w:eastAsiaTheme="majorEastAsia" w:hAnsiTheme="majorHAnsi" w:cstheme="majorBidi"/>
+      <w:rFonts/>
       <w:color w:val="000000" w:themeColor="text1"/>
     </w:rPr>
     <w:tblPr>
@@ -6599,7 +6599,7 @@
       <w:spacing w:after="0" w:line="240" w:lineRule="auto"/>
     </w:pPr>
     <w:rPr>
-      <w:rFonts w:asciiTheme="majorHAnsi" w:eastAsiaTheme="majorEastAsia" w:hAnsiTheme="majorHAnsi" w:cstheme="majorBidi"/>
+      <w:rFonts/>
       <w:color w:val="000000" w:themeColor="text1"/>
     </w:rPr>
     <w:tblPr>
@@ -6727,7 +6727,7 @@
       <w:spacing w:after="0" w:line="240" w:lineRule="auto"/>
     </w:pPr>
     <w:rPr>
-      <w:rFonts w:asciiTheme="majorHAnsi" w:eastAsiaTheme="majorEastAsia" w:hAnsiTheme="majorHAnsi" w:cstheme="majorBidi"/>
+      <w:rFonts/>
       <w:color w:val="000000" w:themeColor="text1"/>
     </w:rPr>
     <w:tblPr>
@@ -6855,7 +6855,7 @@
       <w:spacing w:after="0" w:line="240" w:lineRule="auto"/>
     </w:pPr>
     <w:rPr>
-      <w:rFonts w:asciiTheme="majorHAnsi" w:eastAsiaTheme="majorEastAsia" w:hAnsiTheme="majorHAnsi" w:cstheme="majorBidi"/>
+      <w:rFonts/>
       <w:color w:val="000000" w:themeColor="text1"/>
     </w:rPr>
     <w:tblPr>
@@ -6983,7 +6983,7 @@
       <w:spacing w:after="0" w:line="240" w:lineRule="auto"/>
     </w:pPr>
     <w:rPr>
-      <w:rFonts w:asciiTheme="majorHAnsi" w:eastAsiaTheme="majorEastAsia" w:hAnsiTheme="majorHAnsi" w:cstheme="majorBidi"/>
+      <w:rFonts/>
       <w:color w:val="000000" w:themeColor="text1"/>
     </w:rPr>
     <w:tblPr>
@@ -7111,7 +7111,7 @@
       <w:spacing w:after="0" w:line="240" w:lineRule="auto"/>
     </w:pPr>
     <w:rPr>
-      <w:rFonts w:asciiTheme="majorHAnsi" w:eastAsiaTheme="majorEastAsia" w:hAnsiTheme="majorHAnsi" w:cstheme="majorBidi"/>
+      <w:rFonts/>
       <w:color w:val="000000" w:themeColor="text1"/>
     </w:rPr>
     <w:tblPr>
@@ -7750,7 +7750,7 @@
       <w:spacing w:after="0" w:line="240" w:lineRule="auto"/>
     </w:pPr>
     <w:rPr>
-      <w:rFonts w:asciiTheme="majorHAnsi" w:eastAsiaTheme="majorEastAsia" w:hAnsiTheme="majorHAnsi" w:cstheme="majorBidi"/>
+      <w:rFonts/>
       <w:color w:val="000000" w:themeColor="text1"/>
     </w:rPr>
     <w:tblPr>
@@ -7875,7 +7875,7 @@
       <w:spacing w:after="0" w:line="240" w:lineRule="auto"/>
     </w:pPr>
     <w:rPr>
-      <w:rFonts w:asciiTheme="majorHAnsi" w:eastAsiaTheme="majorEastAsia" w:hAnsiTheme="majorHAnsi" w:cstheme="majorBidi"/>
+      <w:rFonts/>
       <w:color w:val="000000" w:themeColor="text1"/>
     </w:rPr>
     <w:tblPr>
@@ -8000,7 +8000,7 @@
       <w:spacing w:after="0" w:line="240" w:lineRule="auto"/>
     </w:pPr>
     <w:rPr>
-      <w:rFonts w:asciiTheme="majorHAnsi" w:eastAsiaTheme="majorEastAsia" w:hAnsiTheme="majorHAnsi" w:cstheme="majorBidi"/>
+      <w:rFonts/>
       <w:color w:val="000000" w:themeColor="text1"/>
     </w:rPr>
     <w:tblPr>
@@ -8125,7 +8125,7 @@
       <w:spacing w:after="0" w:line="240" w:lineRule="auto"/>
     </w:pPr>
     <w:rPr>
-      <w:rFonts w:asciiTheme="majorHAnsi" w:eastAsiaTheme="majorEastAsia" w:hAnsiTheme="majorHAnsi" w:cstheme="majorBidi"/>
+      <w:rFonts/>
       <w:color w:val="000000" w:themeColor="text1"/>
     </w:rPr>
     <w:tblPr>
@@ -8250,7 +8250,7 @@
       <w:spacing w:after="0" w:line="240" w:lineRule="auto"/>
     </w:pPr>
     <w:rPr>
-      <w:rFonts w:asciiTheme="majorHAnsi" w:eastAsiaTheme="majorEastAsia" w:hAnsiTheme="majorHAnsi" w:cstheme="majorBidi"/>
+      <w:rFonts/>
       <w:color w:val="000000" w:themeColor="text1"/>
     </w:rPr>
     <w:tblPr>
@@ -8375,7 +8375,7 @@
       <w:spacing w:after="0" w:line="240" w:lineRule="auto"/>
     </w:pPr>
     <w:rPr>
-      <w:rFonts w:asciiTheme="majorHAnsi" w:eastAsiaTheme="majorEastAsia" w:hAnsiTheme="majorHAnsi" w:cstheme="majorBidi"/>
+      <w:rFonts/>
       <w:color w:val="000000" w:themeColor="text1"/>
     </w:rPr>
     <w:tblPr>
@@ -8500,7 +8500,7 @@
       <w:spacing w:after="0" w:line="240" w:lineRule="auto"/>
     </w:pPr>
     <w:rPr>
-      <w:rFonts w:asciiTheme="majorHAnsi" w:eastAsiaTheme="majorEastAsia" w:hAnsiTheme="majorHAnsi" w:cstheme="majorBidi"/>
+      <w:rFonts/>
       <w:color w:val="000000" w:themeColor="text1"/>
     </w:rPr>
     <w:tblPr>

</xml_diff>